<commit_message>
:wrench: fix(pre-graduation-practise): Fixup title & antiplagiarism stats
</commit_message>
<xml_diff>
--- a/pre-graduation-practise/docs/Титульный лист.docx
+++ b/pre-graduation-practise/docs/Титульный лист.docx
@@ -701,7 +701,7 @@
           <w:sz w:val="24"/>
           <w:szCs w:val="18"/>
         </w:rPr>
-        <w:t xml:space="preserve">разработка энергоэффективной системы распознавания речи для </w:t>
+        <w:t xml:space="preserve">разработка энергоэффективной системы распознавания </w:t>
       </w:r>
       <w:r>
         <w:rPr>
@@ -711,41 +711,8 @@
           <w:color w:val="000000"/>
           <w:sz w:val="24"/>
           <w:szCs w:val="18"/>
-          <w:lang w:val="en-US"/>
         </w:rPr>
-        <w:t xml:space="preserve">IoT-</w:t>
-      </w:r>
-      <w:r>
-        <w:rPr>
-          <w:rStyle w:val="1035"/>
-          <w:b w:val="0"/>
-          <w:bCs w:val="0"/>
-          <w:color w:val="000000"/>
-          <w:sz w:val="24"/>
-          <w:szCs w:val="18"/>
-          <w:lang w:val="ru-RU"/>
-        </w:rPr>
-        <w:t xml:space="preserve">устройств на базе </w:t>
-      </w:r>
-      <w:r>
-        <w:rPr>
-          <w:rStyle w:val="1035"/>
-          <w:b w:val="0"/>
-          <w:bCs w:val="0"/>
-          <w:color w:val="000000"/>
-          <w:sz w:val="24"/>
-          <w:szCs w:val="18"/>
-          <w:lang w:val="en-US"/>
-        </w:rPr>
-        <w:t xml:space="preserve">ESP32-S3</w:t>
-      </w:r>
-      <w:r>
-        <w:rPr>
-          <w:b w:val="0"/>
-          <w:color w:val="000000"/>
-          <w:sz w:val="24"/>
-          <w:szCs w:val="24"/>
-        </w:rPr>
+        <w:t xml:space="preserve">голосовых команд с использованием нейронных сетей для устройств интернета вещей</w:t>
       </w:r>
       <w:r>
         <w:rPr>
@@ -978,6 +945,14 @@
           <w:szCs w:val="24"/>
         </w:rPr>
       </w:r>
+      <w:r>
+        <w:rPr>
+          <w:b w:val="0"/>
+          <w:color w:val="000000"/>
+          <w:sz w:val="24"/>
+          <w:szCs w:val="24"/>
+        </w:rPr>
+      </w:r>
     </w:p>
     <w:p>
       <w:pPr>
@@ -1014,26 +989,7 @@
           <w:sz w:val="24"/>
           <w:szCs w:val="24"/>
         </w:rPr>
-      </w:r>
-      <w:r>
-        <w:rPr>
-          <w:b w:val="0"/>
-          <w:i/>
-          <w:color w:val="000000"/>
-          <w:sz w:val="24"/>
-          <w:szCs w:val="24"/>
-        </w:rPr>
         <w:t xml:space="preserve">Быковский Сергей Вячеславович, к.т.н., заведущий лабораторией компьютерной инженерии</w:t>
-      </w:r>
-      <w:r/>
-      <w:r>
-        <w:rPr>
-          <w:b w:val="0"/>
-          <w:i/>
-          <w:color w:val="000000"/>
-          <w:sz w:val="24"/>
-          <w:szCs w:val="24"/>
-        </w:rPr>
       </w:r>
       <w:r>
         <w:rPr>

</xml_diff>